<commit_message>
docs: perbarui daftar anggota kelompok pada PRD (docx dan md)
</commit_message>
<xml_diff>
--- a/PRD_SIPERPU.docx
+++ b/PRD_SIPERPU.docx
@@ -224,11 +224,13 @@
               </w:rPr>
               <w:t>1. Hizbullah (NIM: [Isi NIM Anda])</w:t>
               <w:br/>
-              <w:t>2. [Nama Anggota 2] (NIM: [Isi NIM])</w:t>
+              <w:t>2. Muhammad Rizqi Zain (2441919004)</w:t>
               <w:br/>
-              <w:t>3. [Nama Anggota 3] (NIM: [Isi NIM])</w:t>
+              <w:t>3. Annisa Hasanah (2441919025)</w:t>
               <w:br/>
-              <w:t>4. [Nama Anggota 4] (NIM: [Isi NIM])</w:t>
+              <w:t>4. Ananda Fitria (2441919030)</w:t>
+              <w:br/>
+              <w:t>5. Hafizh Ashshahabah Nashiir (2441919052)</w:t>
             </w:r>
           </w:p>
         </w:tc>
@@ -282,7 +284,7 @@
                 <w:color w:val="334155"/>
                 <w:sz w:val="19"/>
               </w:rPr>
-              <w:t>v0.5 (16 Oktober 2026)</w:t>
+              <w:t>v0.5 (22 Oktober 2026)</w:t>
             </w:r>
           </w:p>
         </w:tc>

</xml_diff>